<commit_message>
fix: corrige imagem da documentação do NRZ-I
</commit_message>
<xml_diff>
--- a/nrz_i/docs/documentacao_projeto.docx
+++ b/nrz_i/docs/documentacao_projeto.docx
@@ -485,9 +485,9 @@
           <w:noProof/>
         </w:rPr>
         <w:drawing>
-          <wp:inline distT="0" distB="0" distL="0" distR="0" wp14:anchorId="2ADC4BBF" wp14:editId="02906010">
-            <wp:extent cx="4786989" cy="2692400"/>
-            <wp:effectExtent l="0" t="0" r="0" b="0"/>
+          <wp:inline distT="0" distB="0" distL="0" distR="0" wp14:anchorId="2ADC4BBF" wp14:editId="0C018BD8">
+            <wp:extent cx="4791977" cy="2676390"/>
+            <wp:effectExtent l="0" t="0" r="8890" b="0"/>
             <wp:docPr id="653034910" name="Imagem 1"/>
             <wp:cNvGraphicFramePr>
               <a:graphicFrameLocks xmlns:a="http://schemas.openxmlformats.org/drawingml/2006/main" noChangeAspect="1"/>
@@ -496,11 +496,17 @@
               <a:graphicData uri="http://schemas.openxmlformats.org/drawingml/2006/picture">
                 <pic:pic xmlns:pic="http://schemas.openxmlformats.org/drawingml/2006/picture">
                   <pic:nvPicPr>
-                    <pic:cNvPr id="653034910" name=""/>
+                    <pic:cNvPr id="653034910" name="Imagem 1"/>
                     <pic:cNvPicPr/>
                   </pic:nvPicPr>
                   <pic:blipFill>
-                    <a:blip r:embed="rId5"/>
+                    <a:blip r:embed="rId5" cstate="print">
+                      <a:extLst>
+                        <a:ext uri="{28A0092B-C50C-407E-A947-70E740481C1C}">
+                          <a14:useLocalDpi xmlns:a14="http://schemas.microsoft.com/office/drawing/2010/main" val="0"/>
+                        </a:ext>
+                      </a:extLst>
+                    </a:blip>
                     <a:stretch>
                       <a:fillRect/>
                     </a:stretch>
@@ -508,7 +514,7 @@
                   <pic:spPr>
                     <a:xfrm>
                       <a:off x="0" y="0"/>
-                      <a:ext cx="4791977" cy="2695206"/>
+                      <a:ext cx="4791977" cy="2676390"/>
                     </a:xfrm>
                     <a:prstGeom prst="rect">
                       <a:avLst/>
@@ -1673,9 +1679,15 @@
         <w:rPr>
           <w:rFonts w:ascii="Arial" w:hAnsi="Arial" w:cs="Arial"/>
         </w:rPr>
-        <w:t>bit_index.</w:t>
+        <w:t>bit_index</w:t>
       </w:r>
       <w:proofErr w:type="spellEnd"/>
+      <w:r>
+        <w:rPr>
+          <w:rFonts w:ascii="Arial" w:hAnsi="Arial" w:cs="Arial"/>
+        </w:rPr>
+        <w:t>.</w:t>
+      </w:r>
     </w:p>
     <w:p>
       <w:pPr>

</xml_diff>